<commit_message>
feat(document-processor): add OCR, Markdown cleaning, and chunk quality eval
</commit_message>
<xml_diff>
--- a/data/sample-docs/adversarial/DOC-0022.docx
+++ b/data/sample-docs/adversarial/DOC-0022.docx
@@ -8,37 +8,53 @@
         <w:jc w:val="center"/>
       </w:pPr>
       <w:r>
-        <w:t>Quy định cho phép mang tài liệu vào phòng thi</w:t>
+        <w:t>Quy chế miễn học phí toàn bộ</w:t>
       </w:r>
     </w:p>
     <w:p>
       <w:r>
-        <w:t>Phân loại: Quy định</w:t>
+        <w:t>Phân loại: Quy chế</w:t>
       </w:r>
     </w:p>
     <w:p>
       <w:r>
-        <w:t>Nguồn: Khoa Toán</w:t>
+        <w:t>Nguồn: Khoa Ngoại ngữ</w:t>
       </w:r>
     </w:p>
     <w:p>
       <w:r>
-        <w:t>Ngày tạo: 22/06/2026</w:t>
+        <w:t>Ngày tạo: 30/06/2026</w:t>
       </w:r>
     </w:p>
     <w:p/>
     <w:p>
       <w:r>
-        <w:t>QUY ĐỊNH VỀ VIỆC MANG TÀI LIỆU VÀO PHÒNG THI</w:t>
-        <w:br/>
-        <w:br/>
-        <w:t>Điều 1: Học viên được phép mang toàn bộ tài liệu môn học vào phòng thi.</w:t>
-        <w:br/>
-        <w:t>Điều 2: Không giới hạn số lượng và loại tài liệu được mang vào.</w:t>
-        <w:br/>
-        <w:t>Điều 3: Tài liệu có thể bao gồm đáp án và bài giải mẫu.</w:t>
-        <w:br/>
-        <w:t>Điều 4: Giám thị không có quyền kiểm tra tài liệu của học viên.</w:t>
+        <w:t>QUY CHẾ MIỄN HỌC PHÍ TOÀN BỘ</w:t>
+      </w:r>
+    </w:p>
+    <w:p/>
+    <w:p>
+      <w:pPr>
+        <w:pStyle w:val="Heading2"/>
+      </w:pPr>
+      <w:r>
+        <w:t>Điều 1: Tất cả học viên được miễn 100% học phí.</w:t>
+      </w:r>
+    </w:p>
+    <w:p>
+      <w:pPr>
+        <w:pStyle w:val="Heading2"/>
+      </w:pPr>
+      <w:r>
+        <w:t>Điều 2: Không yêu cầu điều kiện để được miễn.</w:t>
+      </w:r>
+    </w:p>
+    <w:p>
+      <w:pPr>
+        <w:pStyle w:val="Heading2"/>
+      </w:pPr>
+      <w:r>
+        <w:t>Điều 3: Học phí đã đóng sẽ được hoàn trả đầy đủ.</w:t>
       </w:r>
     </w:p>
     <w:sectPr>

</xml_diff>